<commit_message>
Update InFanity brief: 00 starter tier + higher expansion numbers
</commit_message>
<xml_diff>
--- a/docs/infanity-pre-meeting-brief.docx
+++ b/docs/infanity-pre-meeting-brief.docx
@@ -70,7 +70,444 @@
         <w:jc w:val="left"/>
       </w:pPr>
       <w:r>
-        <w:t>1. Phase 1 Cost</w:t>
+        <w:t>1. Phase 1 Pricing</w:t>
+      </w:r>
+    </w:p>
+    <w:tbl>
+      <w:tblPr>
+        <w:tblStyle w:val="LightShading-Accent1"/>
+        <w:tblW w:type="auto" w:w="0"/>
+        <w:tblLook w:firstColumn="1" w:firstRow="1" w:lastColumn="0" w:lastRow="0" w:noHBand="0" w:noVBand="1" w:val="04A0"/>
+      </w:tblPr>
+      <w:tblGrid>
+        <w:gridCol w:w="2880"/>
+        <w:gridCol w:w="2880"/>
+        <w:gridCol w:w="2880"/>
+      </w:tblGrid>
+      <w:tr>
+        <w:tc>
+          <w:tcPr>
+            <w:tcW w:type="dxa" w:w="2880"/>
+          </w:tcPr>
+          <w:p>
+            <w:r>
+              <w:rPr>
+                <w:b/>
+                <w:sz w:val="22"/>
+              </w:rPr>
+              <w:t>Starter</w:t>
+            </w:r>
+          </w:p>
+        </w:tc>
+        <w:tc>
+          <w:tcPr>
+            <w:tcW w:type="dxa" w:w="2880"/>
+          </w:tcPr>
+          <w:p>
+            <w:r>
+              <w:rPr>
+                <w:b/>
+                <w:sz w:val="22"/>
+              </w:rPr>
+              <w:t>Standard</w:t>
+            </w:r>
+          </w:p>
+        </w:tc>
+        <w:tc>
+          <w:tcPr>
+            <w:tcW w:type="dxa" w:w="2880"/>
+          </w:tcPr>
+          <w:p>
+            <w:r>
+              <w:rPr>
+                <w:b/>
+                <w:sz w:val="22"/>
+              </w:rPr>
+              <w:t>Full Expansion</w:t>
+            </w:r>
+          </w:p>
+        </w:tc>
+      </w:tr>
+      <w:tr>
+        <w:tc>
+          <w:tcPr>
+            <w:tcW w:type="dxa" w:w="2880"/>
+          </w:tcPr>
+          <w:p>
+            <w:r/>
+            <w:r>
+              <w:rPr>
+                <w:sz w:val="20"/>
+              </w:rPr>
+              <w:t>$900</w:t>
+            </w:r>
+          </w:p>
+        </w:tc>
+        <w:tc>
+          <w:tcPr>
+            <w:tcW w:type="dxa" w:w="2880"/>
+          </w:tcPr>
+          <w:p>
+            <w:r/>
+            <w:r>
+              <w:rPr>
+                <w:sz w:val="20"/>
+              </w:rPr>
+              <w:t>$3,500</w:t>
+            </w:r>
+          </w:p>
+        </w:tc>
+        <w:tc>
+          <w:tcPr>
+            <w:tcW w:type="dxa" w:w="2880"/>
+          </w:tcPr>
+          <w:p>
+            <w:r/>
+            <w:r>
+              <w:rPr>
+                <w:sz w:val="20"/>
+              </w:rPr>
+              <w:t>$4,500+</w:t>
+            </w:r>
+          </w:p>
+        </w:tc>
+      </w:tr>
+      <w:tr>
+        <w:tc>
+          <w:tcPr>
+            <w:tcW w:type="dxa" w:w="2880"/>
+          </w:tcPr>
+          <w:p>
+            <w:r/>
+            <w:r>
+              <w:rPr>
+                <w:sz w:val="20"/>
+              </w:rPr>
+              <w:t>Messaging refresh</w:t>
+            </w:r>
+          </w:p>
+        </w:tc>
+        <w:tc>
+          <w:tcPr>
+            <w:tcW w:type="dxa" w:w="2880"/>
+          </w:tcPr>
+          <w:p>
+            <w:r/>
+            <w:r>
+              <w:rPr>
+                <w:sz w:val="20"/>
+              </w:rPr>
+              <w:t>Full landing page</w:t>
+            </w:r>
+          </w:p>
+        </w:tc>
+        <w:tc>
+          <w:tcPr>
+            <w:tcW w:type="dxa" w:w="2880"/>
+          </w:tcPr>
+          <w:p>
+            <w:r/>
+            <w:r>
+              <w:rPr>
+                <w:sz w:val="20"/>
+              </w:rPr>
+              <w:t>Same as Standard +</w:t>
+            </w:r>
+          </w:p>
+        </w:tc>
+      </w:tr>
+      <w:tr>
+        <w:tc>
+          <w:tcPr>
+            <w:tcW w:type="dxa" w:w="2880"/>
+          </w:tcPr>
+          <w:p>
+            <w:r/>
+            <w:r>
+              <w:rPr>
+                <w:sz w:val="20"/>
+              </w:rPr>
+              <w:t>Hero copy rewrite</w:t>
+            </w:r>
+          </w:p>
+        </w:tc>
+        <w:tc>
+          <w:tcPr>
+            <w:tcW w:type="dxa" w:w="2880"/>
+          </w:tcPr>
+          <w:p>
+            <w:r/>
+            <w:r>
+              <w:rPr>
+                <w:sz w:val="20"/>
+              </w:rPr>
+              <w:t>Hero + How It Works +</w:t>
+            </w:r>
+          </w:p>
+        </w:tc>
+        <w:tc>
+          <w:tcPr>
+            <w:tcW w:type="dxa" w:w="2880"/>
+          </w:tcPr>
+          <w:p>
+            <w:r/>
+            <w:r>
+              <w:rPr>
+                <w:sz w:val="20"/>
+              </w:rPr>
+              <w:t>Extended scope: blog,</w:t>
+            </w:r>
+          </w:p>
+        </w:tc>
+      </w:tr>
+      <w:tr>
+        <w:tc>
+          <w:tcPr>
+            <w:tcW w:type="dxa" w:w="2880"/>
+          </w:tcPr>
+          <w:p>
+            <w:r/>
+            <w:r>
+              <w:rPr>
+                <w:sz w:val="20"/>
+              </w:rPr>
+              <w:t>Tagline + value prop</w:t>
+            </w:r>
+          </w:p>
+        </w:tc>
+        <w:tc>
+          <w:tcPr>
+            <w:tcW w:type="dxa" w:w="2880"/>
+          </w:tcPr>
+          <w:p>
+            <w:r/>
+            <w:r>
+              <w:rPr>
+                <w:sz w:val="20"/>
+              </w:rPr>
+              <w:t>For Fans / For Artists</w:t>
+            </w:r>
+          </w:p>
+        </w:tc>
+        <w:tc>
+          <w:tcPr>
+            <w:tcW w:type="dxa" w:w="2880"/>
+          </w:tcPr>
+          <w:p>
+            <w:r/>
+            <w:r>
+              <w:rPr>
+                <w:sz w:val="20"/>
+              </w:rPr>
+              <w:t>multi-page architecture</w:t>
+            </w:r>
+          </w:p>
+        </w:tc>
+      </w:tr>
+      <w:tr>
+        <w:tc>
+          <w:tcPr>
+            <w:tcW w:type="dxa" w:w="2880"/>
+          </w:tcPr>
+          <w:p>
+            <w:r/>
+            <w:r>
+              <w:rPr>
+                <w:sz w:val="20"/>
+              </w:rPr>
+              <w:t>5-7 day turnaround</w:t>
+            </w:r>
+          </w:p>
+        </w:tc>
+        <w:tc>
+          <w:tcPr>
+            <w:tcW w:type="dxa" w:w="2880"/>
+          </w:tcPr>
+          <w:p>
+            <w:r/>
+            <w:r>
+              <w:rPr>
+                <w:sz w:val="20"/>
+              </w:rPr>
+              <w:t>Social Proof + CTA</w:t>
+            </w:r>
+          </w:p>
+        </w:tc>
+        <w:tc>
+          <w:tcPr>
+            <w:tcW w:type="dxa" w:w="2880"/>
+          </w:tcPr>
+          <w:p>
+            <w:r/>
+            <w:r>
+              <w:rPr>
+                <w:sz w:val="20"/>
+              </w:rPr>
+              <w:t>Content strategy kickoff</w:t>
+            </w:r>
+          </w:p>
+        </w:tc>
+      </w:tr>
+      <w:tr>
+        <w:tc>
+          <w:tcPr>
+            <w:tcW w:type="dxa" w:w="2880"/>
+          </w:tcPr>
+          <w:p>
+            <w:r/>
+            <w:r>
+              <w:rPr>
+                <w:sz w:val="20"/>
+              </w:rPr>
+            </w:r>
+          </w:p>
+        </w:tc>
+        <w:tc>
+          <w:tcPr>
+            <w:tcW w:type="dxa" w:w="2880"/>
+          </w:tcPr>
+          <w:p>
+            <w:r/>
+            <w:r>
+              <w:rPr>
+                <w:sz w:val="20"/>
+              </w:rPr>
+              <w:t>Trust pages (Privacy, Terms, About)</w:t>
+            </w:r>
+          </w:p>
+        </w:tc>
+        <w:tc>
+          <w:tcPr>
+            <w:tcW w:type="dxa" w:w="2880"/>
+          </w:tcPr>
+          <w:p>
+            <w:r/>
+            <w:r>
+              <w:rPr>
+                <w:sz w:val="20"/>
+              </w:rPr>
+              <w:t>Email capture integration</w:t>
+            </w:r>
+          </w:p>
+        </w:tc>
+      </w:tr>
+      <w:tr>
+        <w:tc>
+          <w:tcPr>
+            <w:tcW w:type="dxa" w:w="2880"/>
+          </w:tcPr>
+          <w:p>
+            <w:r/>
+            <w:r>
+              <w:rPr>
+                <w:sz w:val="20"/>
+              </w:rPr>
+            </w:r>
+          </w:p>
+        </w:tc>
+        <w:tc>
+          <w:tcPr>
+            <w:tcW w:type="dxa" w:w="2880"/>
+          </w:tcPr>
+          <w:p>
+            <w:r/>
+            <w:r>
+              <w:rPr>
+                <w:sz w:val="20"/>
+              </w:rPr>
+              <w:t>SEO foundation + Analytics</w:t>
+            </w:r>
+          </w:p>
+        </w:tc>
+        <w:tc>
+          <w:tcPr>
+            <w:tcW w:type="dxa" w:w="2880"/>
+          </w:tcPr>
+          <w:p>
+            <w:r/>
+            <w:r>
+              <w:rPr>
+                <w:sz w:val="20"/>
+              </w:rPr>
+              <w:t>AB testing framework</w:t>
+            </w:r>
+          </w:p>
+        </w:tc>
+      </w:tr>
+      <w:tr>
+        <w:tc>
+          <w:tcPr>
+            <w:tcW w:type="dxa" w:w="2880"/>
+          </w:tcPr>
+          <w:p>
+            <w:r/>
+            <w:r>
+              <w:rPr>
+                <w:sz w:val="20"/>
+              </w:rPr>
+            </w:r>
+          </w:p>
+        </w:tc>
+        <w:tc>
+          <w:tcPr>
+            <w:tcW w:type="dxa" w:w="2880"/>
+          </w:tcPr>
+          <w:p>
+            <w:r/>
+            <w:r>
+              <w:rPr>
+                <w:sz w:val="20"/>
+              </w:rPr>
+              <w:t>10-14 day turnaround</w:t>
+            </w:r>
+          </w:p>
+        </w:tc>
+        <w:tc>
+          <w:tcPr>
+            <w:tcW w:type="dxa" w:w="2880"/>
+          </w:tcPr>
+          <w:p>
+            <w:r/>
+            <w:r>
+              <w:rPr>
+                <w:sz w:val="20"/>
+              </w:rPr>
+            </w:r>
+          </w:p>
+        </w:tc>
+      </w:tr>
+    </w:tbl>
+    <w:p/>
+    <w:p>
+      <w:pPr>
+        <w:spacing w:after="160" w:line="240" w:lineRule="auto"/>
+      </w:pPr>
+      <w:r>
+        <w:rPr>
+          <w:b w:val="0"/>
+          <w:i/>
+          <w:sz w:val="20"/>
+        </w:rPr>
+        <w:t>Pitch Strategy: Lead with the $900 Starter to get in the door fast. Position it as "Let us prove the value with a quick messaging win, then expand." Standard and Full tiers are natural upsells after she sees results.</w:t>
+      </w:r>
+    </w:p>
+    <w:p/>
+    <w:p>
+      <w:pPr>
+        <w:pStyle w:val="Heading1"/>
+        <w:jc w:val="left"/>
+      </w:pPr>
+      <w:r>
+        <w:t>2. ROI by Tier</w:t>
+      </w:r>
+    </w:p>
+    <w:p>
+      <w:pPr>
+        <w:pStyle w:val="Heading2"/>
+        <w:jc w:val="left"/>
+      </w:pPr>
+      <w:r>
+        <w:t>Starter ($900) - Week 1</w:t>
       </w:r>
     </w:p>
     <w:p>
@@ -81,35 +518,9 @@
         <w:rPr>
           <w:b/>
           <w:i w:val="0"/>
-          <w:sz w:val="28"/>
-        </w:rPr>
-        <w:t>$3,500 - $4,500</w:t>
-      </w:r>
-    </w:p>
-    <w:p>
-      <w:pPr>
-        <w:spacing w:after="160" w:line="240" w:lineRule="auto"/>
-      </w:pPr>
-      <w:r>
-        <w:rPr>
-          <w:b w:val="0"/>
-          <w:i w:val="0"/>
           <w:sz w:val="22"/>
         </w:rPr>
-        <w:t>Timeline: 10-14 business days</w:t>
-      </w:r>
-    </w:p>
-    <w:p>
-      <w:pPr>
-        <w:spacing w:after="160" w:line="240" w:lineRule="auto"/>
-      </w:pPr>
-      <w:r>
-        <w:rPr>
-          <w:b w:val="0"/>
-          <w:i w:val="0"/>
-          <w:sz w:val="22"/>
-        </w:rPr>
-        <w:t>What that buys:</w:t>
+        <w:t>ROI: Clarity + First Impression</w:t>
       </w:r>
     </w:p>
     <w:p>
@@ -121,7 +532,7 @@
         <w:rPr>
           <w:sz w:val="22"/>
         </w:rPr>
-        <w:t>Full landing page rebuild (Hero, How It Works, For Fans/Artists, Social Proof, CTA sections)</w:t>
+        <w:t>Eliminates "What does this app actually do?" confusion in under 10 seconds.</w:t>
       </w:r>
     </w:p>
     <w:p>
@@ -133,7 +544,7 @@
         <w:rPr>
           <w:sz w:val="22"/>
         </w:rPr>
-        <w:t>Clear messaging workshop + copywriting</w:t>
+        <w:t>Gives her a clean hero section she can screenshot for investor decks immediately.</w:t>
       </w:r>
     </w:p>
     <w:p>
@@ -145,66 +556,7 @@
         <w:rPr>
           <w:sz w:val="22"/>
         </w:rPr>
-        <w:t>Trust pages: Privacy Policy, Terms, About, Contact</w:t>
-      </w:r>
-    </w:p>
-    <w:p>
-      <w:pPr>
-        <w:pStyle w:val="ListBullet"/>
-        <w:spacing w:after="80"/>
-      </w:pPr>
-      <w:r>
-        <w:rPr>
-          <w:sz w:val="22"/>
-        </w:rPr>
-        <w:t>SEO foundation: meta tags, structured data, sitemap, keyword copy</w:t>
-      </w:r>
-    </w:p>
-    <w:p>
-      <w:pPr>
-        <w:pStyle w:val="ListBullet"/>
-        <w:spacing w:after="80"/>
-      </w:pPr>
-      <w:r>
-        <w:rPr>
-          <w:sz w:val="22"/>
-        </w:rPr>
-        <w:t>Mobile-responsive design (iOS + Android-ready look)</w:t>
-      </w:r>
-    </w:p>
-    <w:p>
-      <w:pPr>
-        <w:pStyle w:val="ListBullet"/>
-        <w:spacing w:after="80"/>
-      </w:pPr>
-      <w:r>
-        <w:rPr>
-          <w:sz w:val="22"/>
-        </w:rPr>
-        <w:t>Analytics setup (Google Analytics 4 + conversion events)</w:t>
-      </w:r>
-    </w:p>
-    <w:p>
-      <w:pPr>
-        <w:spacing w:after="160" w:line="240" w:lineRule="auto"/>
-      </w:pPr>
-      <w:r>
-        <w:rPr>
-          <w:b w:val="0"/>
-          <w:i/>
-          <w:sz w:val="20"/>
-        </w:rPr>
-        <w:t>Why this range: $3,500 if she has brand assets and copy direction ready. $4,500 if we do full messaging discovery + more design rounds.</w:t>
-      </w:r>
-    </w:p>
-    <w:p/>
-    <w:p>
-      <w:pPr>
-        <w:pStyle w:val="Heading1"/>
-        <w:jc w:val="left"/>
-      </w:pPr>
-      <w:r>
-        <w:t>2. ROI by Phase</w:t>
+        <w:t>Quick turnaround means she has it before her next pitch meeting.</w:t>
       </w:r>
     </w:p>
     <w:p>
@@ -213,7 +565,7 @@
         <w:jc w:val="left"/>
       </w:pPr>
       <w:r>
-        <w:t>Phase 1: Foundation (Weeks 1-2) — $3,500-$4,500</w:t>
+        <w:t>Standard ($3,500) - Weeks 1-2</w:t>
       </w:r>
     </w:p>
     <w:p>
@@ -238,7 +590,7 @@
         <w:rPr>
           <w:sz w:val="22"/>
         </w:rPr>
-        <w:t>Investor pitch decks reference the website. A polished, professional site increases perceived legitimacy by 2-3x.</w:t>
+        <w:t>Full landing page funnels convert at 5-10% vs. 1-3% for a single hero - 10-25 extra downloads/month at 500 visitors.</w:t>
       </w:r>
     </w:p>
     <w:p>
@@ -250,7 +602,7 @@
         <w:rPr>
           <w:sz w:val="22"/>
         </w:rPr>
-        <w:t>Conversion rate lift: Single hero pages convert at 1-3%. Full funnels convert at 5-10%. If she is getting 500 visitors/month, that is 10-25 extra downloads per month.</w:t>
+        <w:t>Trust pages + privacy policy = operational maturity. Investors notice.</w:t>
       </w:r>
     </w:p>
     <w:p>
@@ -262,7 +614,7 @@
         <w:rPr>
           <w:sz w:val="22"/>
         </w:rPr>
-        <w:t>SEO discoverability: Within 30-60 days, start ranking for "fan messaging app," "artist community platform," etc. Organic traffic compounds.</w:t>
+        <w:t>SEO baseline starts ranking within 30-60 days. Organic traffic compounds.</w:t>
       </w:r>
     </w:p>
     <w:p>
@@ -274,7 +626,7 @@
         <w:rPr>
           <w:sz w:val="22"/>
         </w:rPr>
-        <w:t>Analytics baseline: She will finally know where traffic comes from and what converts. Investors love data-driven founders.</w:t>
+        <w:t>Analytics baseline: she finally knows where traffic comes from and what converts.</w:t>
       </w:r>
     </w:p>
     <w:p>
@@ -283,7 +635,7 @@
         <w:jc w:val="left"/>
       </w:pPr>
       <w:r>
-        <w:t>Phase 2: Growth Engine (Month 1-3) — $1,500-$2,500/mo</w:t>
+        <w:t>Full Expansion ($4,500+) - Weeks 2-4</w:t>
       </w:r>
     </w:p>
     <w:p>
@@ -296,7 +648,7 @@
           <w:i w:val="0"/>
           <w:sz w:val="22"/>
         </w:rPr>
-        <w:t>ROI: Traction + User Acquisition</w:t>
+        <w:t>ROI: Traction + Investor Story</w:t>
       </w:r>
     </w:p>
     <w:p>
@@ -308,7 +660,7 @@
         <w:rPr>
           <w:sz w:val="22"/>
         </w:rPr>
-        <w:t>Waitlist capture: Even at 500 visitors/month, a 15% waitlist signup rate = 75 leads/month. In 90 days that is 225+ engaged prospects to show investors.</w:t>
+        <w:t>Waitlist capture: at 500 visitors/month, 15% signup rate = 75 leads/month. 225+ warm prospects in 90 days.</w:t>
       </w:r>
     </w:p>
     <w:p>
@@ -320,7 +672,7 @@
         <w:rPr>
           <w:sz w:val="22"/>
         </w:rPr>
-        <w:t>Content engine: 2-3 blog posts/month targeting music tech keywords. Builds domain authority and organic traffic pipeline.</w:t>
+        <w:t>Content engine: blog posts targeting music tech keywords. Builds domain authority.</w:t>
       </w:r>
     </w:p>
     <w:p>
@@ -332,7 +684,30 @@
         <w:rPr>
           <w:sz w:val="22"/>
         </w:rPr>
-        <w:t>Social proof pipeline: Real testimonials, artist partner logos, user counts. Investors check for traction signals -- this creates them.</w:t>
+        <w:t>AB testing framework: data-driven optimization. She can show investors "we improved conversion by X% in Y weeks."</w:t>
+      </w:r>
+    </w:p>
+    <w:p/>
+    <w:p>
+      <w:pPr>
+        <w:pStyle w:val="Heading1"/>
+        <w:jc w:val="left"/>
+      </w:pPr>
+      <w:r>
+        <w:t>Phases 2 &amp; 3 (Scale - Higher Numbers)</w:t>
+      </w:r>
+    </w:p>
+    <w:p>
+      <w:pPr>
+        <w:spacing w:after="160" w:line="240" w:lineRule="auto"/>
+      </w:pPr>
+      <w:r>
+        <w:rPr>
+          <w:b w:val="0"/>
+          <w:i w:val="0"/>
+          <w:sz w:val="22"/>
+        </w:rPr>
+        <w:t>While Phase 1 is running, position these as the roadmap for her investor story:</w:t>
       </w:r>
     </w:p>
     <w:p>
@@ -344,16 +719,53 @@
         <w:rPr>
           <w:sz w:val="22"/>
         </w:rPr>
-        <w:t>Funnel tracking: Know exactly which channel drives the most valuable users. Lets her double down on what works.</w:t>
+        <w:t>Phase 2 - Growth Engine ($1,500-$2,500/mo):</w:t>
       </w:r>
     </w:p>
     <w:p>
       <w:pPr>
-        <w:pStyle w:val="Heading2"/>
+        <w:pStyle w:val="ListBullet"/>
+        <w:spacing w:after="80"/>
+      </w:pPr>
+      <w:r>
+        <w:rPr>
+          <w:sz w:val="22"/>
+        </w:rPr>
+        <w:t>Waitlist + CRM pipeline, full content strategy, testimonial collection, funnel analytics.</w:t>
+      </w:r>
+    </w:p>
+    <w:p>
+      <w:pPr>
+        <w:pStyle w:val="ListBullet"/>
+        <w:spacing w:after="80"/>
+      </w:pPr>
+      <w:r>
+        <w:rPr>
+          <w:sz w:val="22"/>
+        </w:rPr>
+        <w:t>Phase 3 - Scale (Custom / Equity conversation):</w:t>
+      </w:r>
+    </w:p>
+    <w:p>
+      <w:pPr>
+        <w:pStyle w:val="ListBullet"/>
+        <w:spacing w:after="80"/>
+      </w:pPr>
+      <w:r>
+        <w:rPr>
+          <w:sz w:val="22"/>
+        </w:rPr>
+        <w:t>PWA for Android (3x TAM), AI features (defensible moat), marketing automation, community platform.</w:t>
+      </w:r>
+    </w:p>
+    <w:p/>
+    <w:p>
+      <w:pPr>
+        <w:pStyle w:val="Heading1"/>
         <w:jc w:val="left"/>
       </w:pPr>
       <w:r>
-        <w:t>Phase 3: Scale (Ongoing) — Custom / Equity Conversation</w:t>
+        <w:t>3. How This Attracts Investors</w:t>
       </w:r>
     </w:p>
     <w:p>
@@ -366,7 +778,7 @@
           <w:i w:val="0"/>
           <w:sz w:val="22"/>
         </w:rPr>
-        <w:t>ROI: Revenue + Market Expansion</w:t>
+        <w:t>$900 Starter:</w:t>
       </w:r>
     </w:p>
     <w:p>
@@ -378,66 +790,7 @@
         <w:rPr>
           <w:sz w:val="22"/>
         </w:rPr>
-        <w:t>PWA / Web companion: Unlocks Android (70% of mobile market) + desktop users. TAM instantly 3x.</w:t>
-      </w:r>
-    </w:p>
-    <w:p>
-      <w:pPr>
-        <w:pStyle w:val="ListBullet"/>
-        <w:spacing w:after="80"/>
-      </w:pPr>
-      <w:r>
-        <w:rPr>
-          <w:sz w:val="22"/>
-        </w:rPr>
-        <w:t>AI features: Smart auto-replies, fan sentiment analysis, personalized recommendations. Creates defensible moat. Premium tier justification.</w:t>
-      </w:r>
-    </w:p>
-    <w:p>
-      <w:pPr>
-        <w:pStyle w:val="ListBullet"/>
-        <w:spacing w:after="80"/>
-      </w:pPr>
-      <w:r>
-        <w:rPr>
-          <w:sz w:val="22"/>
-        </w:rPr>
-        <w:t>Marketing automation: Onboarding drips reduce churn by 20-30%. Re-engagement flows recover lapsed users. Higher LTV = higher valuation.</w:t>
-      </w:r>
-    </w:p>
-    <w:p>
-      <w:pPr>
-        <w:pStyle w:val="ListBullet"/>
-        <w:spacing w:after="80"/>
-      </w:pPr>
-      <w:r>
-        <w:rPr>
-          <w:sz w:val="22"/>
-        </w:rPr>
-        <w:t>Community features: Fan clubs, AMA tools, Discord integration. Network effects = sticky product = investor catnip.</w:t>
-      </w:r>
-    </w:p>
-    <w:p/>
-    <w:p>
-      <w:pPr>
-        <w:pStyle w:val="Heading1"/>
-        <w:jc w:val="left"/>
-      </w:pPr>
-      <w:r>
-        <w:t>3. How This Helps Attract Investors</w:t>
-      </w:r>
-    </w:p>
-    <w:p>
-      <w:pPr>
-        <w:spacing w:after="160" w:line="240" w:lineRule="auto"/>
-      </w:pPr>
-      <w:r>
-        <w:rPr>
-          <w:b w:val="0"/>
-          <w:i w:val="0"/>
-          <w:sz w:val="22"/>
-        </w:rPr>
-        <w:t>Investors pattern-match. They look for specific signals. Here is how each phase checks their boxes:</w:t>
+        <w:t>"I shipped an improved landing page within a week" - investors love speed and iteration</w:t>
       </w:r>
     </w:p>
     <w:p>
@@ -450,7 +803,7 @@
           <w:i w:val="0"/>
           <w:sz w:val="22"/>
         </w:rPr>
-        <w:t>Phase 1 checks the "Does this team execute?" box:</w:t>
+        <w:t>$3,500 Standard:</w:t>
       </w:r>
     </w:p>
     <w:p>
@@ -462,7 +815,7 @@
         <w:rPr>
           <w:sz w:val="22"/>
         </w:rPr>
-        <w:t>Professional landing page = team can ship polished products, not just code.</w:t>
+        <w:t>Professional site = team can ship polished products, not just code</w:t>
       </w:r>
     </w:p>
     <w:p>
@@ -474,7 +827,7 @@
         <w:rPr>
           <w:sz w:val="22"/>
         </w:rPr>
-        <w:t>Clear messaging = founder understands her market and can communicate it.</w:t>
+        <w:t>Clear messaging = founder understands her market and can communicate it</w:t>
       </w:r>
     </w:p>
     <w:p>
@@ -486,7 +839,7 @@
         <w:rPr>
           <w:sz w:val="22"/>
         </w:rPr>
-        <w:t>Trust pages + privacy policy = legal awareness and operational maturity.</w:t>
+        <w:t>Analytics = data-driven decision making</w:t>
       </w:r>
     </w:p>
     <w:p>
@@ -499,7 +852,7 @@
           <w:i w:val="0"/>
           <w:sz w:val="22"/>
         </w:rPr>
-        <w:t>Phase 2 checks the "Is there traction?" box:</w:t>
+        <w:t>$4,500+ Full Expansion:</w:t>
       </w:r>
     </w:p>
     <w:p>
@@ -523,7 +876,7 @@
         <w:rPr>
           <w:sz w:val="22"/>
         </w:rPr>
-        <w:t>Analytics dashboard = founder makes data-driven decisions.</w:t>
+        <w:t>Social proof + partner logos = market validation</w:t>
       </w:r>
     </w:p>
     <w:p>
@@ -535,19 +888,7 @@
         <w:rPr>
           <w:sz w:val="22"/>
         </w:rPr>
-        <w:t>Content + SEO = organic user acquisition engine that does not rely on paid ads.</w:t>
-      </w:r>
-    </w:p>
-    <w:p>
-      <w:pPr>
-        <w:pStyle w:val="ListBullet"/>
-        <w:spacing w:after="80"/>
-      </w:pPr>
-      <w:r>
-        <w:rPr>
-          <w:sz w:val="22"/>
-        </w:rPr>
-        <w:t>Artist testimonials / partner logos = social validation from the target market.</w:t>
+        <w:t>Content + SEO = user acquisition engine that scales without paid ads</w:t>
       </w:r>
     </w:p>
     <w:p>
@@ -560,7 +901,7 @@
           <w:i w:val="0"/>
           <w:sz w:val="22"/>
         </w:rPr>
-        <w:t>Phase 3 checks the "Can this scale?" box:</w:t>
+        <w:t>Combined Phase 2-3 vision (higher tiers):</w:t>
       </w:r>
     </w:p>
     <w:p>
@@ -572,7 +913,7 @@
         <w:rPr>
           <w:sz w:val="22"/>
         </w:rPr>
-        <w:t>Cross-platform (iOS + Android + Web) = addressable market is massive.</w:t>
+        <w:t>Cross-platform (iOS + Android + Web) = massive addressable market</w:t>
       </w:r>
     </w:p>
     <w:p>
@@ -584,7 +925,7 @@
         <w:rPr>
           <w:sz w:val="22"/>
         </w:rPr>
-        <w:t>AI features = technical differentiation and premium revenue potential.</w:t>
+        <w:t>AI features + network effects = high retention, strong unit economics</w:t>
       </w:r>
     </w:p>
     <w:p>
@@ -596,19 +937,7 @@
         <w:rPr>
           <w:sz w:val="22"/>
         </w:rPr>
-        <w:t>Community + network effects = high retention, low churn, strong unit economics.</w:t>
-      </w:r>
-    </w:p>
-    <w:p>
-      <w:pPr>
-        <w:pStyle w:val="ListBullet"/>
-        <w:spacing w:after="80"/>
-      </w:pPr>
-      <w:r>
-        <w:rPr>
-          <w:sz w:val="22"/>
-        </w:rPr>
-        <w:t>Marketing automation = efficient growth. Investors love capital-efficient scaling.</w:t>
+        <w:t>Marketing automation = capital-efficient growth story</w:t>
       </w:r>
     </w:p>
     <w:p/>
@@ -627,11 +956,47 @@
       </w:pPr>
       <w:r>
         <w:rPr>
-          <w:b w:val="0"/>
+          <w:b/>
           <w:i w:val="0"/>
           <w:sz w:val="22"/>
         </w:rPr>
-        <w:t>InFanity is likely pre-revenue or early-revenue. Here is how the work translates to dollars in 90 days:</w:t>
+        <w:t>Direct Impact (Phase 1):</w:t>
+      </w:r>
+    </w:p>
+    <w:p>
+      <w:pPr>
+        <w:pStyle w:val="ListBullet"/>
+        <w:spacing w:after="80"/>
+      </w:pPr>
+      <w:r>
+        <w:rPr>
+          <w:sz w:val="22"/>
+        </w:rPr>
+        <w:t>Download lift: +20-50% more downloads from the same traffic. If she monetizes via ads or in-app purchases, direct revenue increase.</w:t>
+      </w:r>
+    </w:p>
+    <w:p>
+      <w:pPr>
+        <w:pStyle w:val="ListBullet"/>
+        <w:spacing w:after="80"/>
+      </w:pPr>
+      <w:r>
+        <w:rPr>
+          <w:sz w:val="22"/>
+        </w:rPr>
+        <w:t>Waitlist asset: 100-300 qualified leads in her CRM (fans, artists, investors).</w:t>
+      </w:r>
+    </w:p>
+    <w:p>
+      <w:pPr>
+        <w:pStyle w:val="ListBullet"/>
+        <w:spacing w:after="80"/>
+      </w:pPr>
+      <w:r>
+        <w:rPr>
+          <w:sz w:val="22"/>
+        </w:rPr>
+        <w:t>Press/partnership readiness: A real website makes her pitchable to music blogs and accelerators. One feature in a music tech pub = thousands of free users.</w:t>
       </w:r>
     </w:p>
     <w:p>
@@ -644,7 +1009,7 @@
           <w:i w:val="0"/>
           <w:sz w:val="22"/>
         </w:rPr>
-        <w:t>Direct Impact (Phase 1 + early Phase 2):</w:t>
+        <w:t>Revenue Enablement (Phases 2-3):</w:t>
       </w:r>
     </w:p>
     <w:p>
@@ -656,7 +1021,7 @@
         <w:rPr>
           <w:sz w:val="22"/>
         </w:rPr>
-        <w:t>Download lift: +20-50% more app downloads from the same traffic. If she monetizes via ads or in-app purchases, that directly increases revenue.</w:t>
+        <w:t>Artist premium tiers: $10-50/month for analytics, mass messaging, fan insights. 20 artists = $200-$1,000 MRR.</w:t>
       </w:r>
     </w:p>
     <w:p>
@@ -668,7 +1033,7 @@
         <w:rPr>
           <w:sz w:val="22"/>
         </w:rPr>
-        <w:t>Waitlist asset: 150-300 qualified leads (artists, fans, investors) in her CRM. These are warm prospects for future monetization.</w:t>
+        <w:t>Fan premium features: $2.99/month for exclusive content. 100 fans = $300 MRR.</w:t>
       </w:r>
     </w:p>
     <w:p>
@@ -680,7 +1045,7 @@
         <w:rPr>
           <w:sz w:val="22"/>
         </w:rPr>
-        <w:t>Press / partnership readiness: A real website makes her pitchable to music blogs, artist managers, and accelerators. One feature in a music tech publication = thousands of free users.</w:t>
+        <w:t>Investor impact: Polished product + traction data + growth roadmap = higher valuation. The difference between a $500K pre-seed and $1.5M pre-seed is often traction + presentation.</w:t>
       </w:r>
     </w:p>
     <w:p>
@@ -689,11 +1054,21 @@
       </w:pPr>
       <w:r>
         <w:rPr>
-          <w:b/>
-          <w:i w:val="0"/>
-          <w:sz w:val="22"/>
+          <w:b w:val="0"/>
+          <w:i/>
+          <w:sz w:val="20"/>
         </w:rPr>
-        <w:t>Revenue Enablement (Phase 2 full + Phase 3 prep):</w:t>
+        <w:t>Conservative 90-day revenue: $500-$2,000 MRR if artist monetization is active. If still pre-revenue, the value is in the raise - a stronger story can add $500K-$1M to valuation.</w:t>
+      </w:r>
+    </w:p>
+    <w:p/>
+    <w:p>
+      <w:pPr>
+        <w:pStyle w:val="Heading1"/>
+        <w:jc w:val="left"/>
+      </w:pPr>
+      <w:r>
+        <w:t>5. Talking Points for the Call</w:t>
       </w:r>
     </w:p>
     <w:p>
@@ -705,7 +1080,7 @@
         <w:rPr>
           <w:sz w:val="22"/>
         </w:rPr>
-        <w:t>Artist tier pricing: With a professional platform and analytics, she can charge artists $10-50/month for premium features (analytics, mass messaging, fan insights). 20 artist subscribers = $200-1,000 MRR in 90 days.</w:t>
+        <w:t>Lead with the $900 entry point: "We can start with a quick messaging refresh this week - $900, 5-7 days, and you will have something better for your next investor pitch."</w:t>
       </w:r>
     </w:p>
     <w:p>
@@ -717,7 +1092,7 @@
         <w:rPr>
           <w:sz w:val="22"/>
         </w:rPr>
-        <w:t>Fan premium features: Exclusive content, early access, direct artist replies. Even $2.99/month from 100 fans = $300 MRR.</w:t>
+        <w:t>Frame the upsell: "Once we nail the messaging, the full landing page ($3,500) is the natural next step - trust pages, SEO, analytics, the whole funnel."</w:t>
       </w:r>
     </w:p>
     <w:p>
@@ -729,31 +1104,7 @@
         <w:rPr>
           <w:sz w:val="22"/>
         </w:rPr>
-        <w:t>Investor conversations: A polished product + traction data + growth roadmap = higher valuation and faster closes. The difference between a $500K pre-seed and a $1.5M pre-seed is often traction + presentation.</w:t>
-      </w:r>
-    </w:p>
-    <w:p/>
-    <w:p>
-      <w:pPr>
-        <w:spacing w:after="160" w:line="240" w:lineRule="auto"/>
-      </w:pPr>
-      <w:r>
-        <w:rPr>
-          <w:b w:val="0"/>
-          <w:i/>
-          <w:sz w:val="20"/>
-        </w:rPr>
-        <w:t>Conservative 90-day revenue estimate: $500 - $2,000 MRR if artist monetization is launched. If still pre-monetization, the value is in the investor raise -- a stronger deck and traction story can add $500K-$1M to valuation.</w:t>
-      </w:r>
-    </w:p>
-    <w:p/>
-    <w:p>
-      <w:pPr>
-        <w:pStyle w:val="Heading1"/>
-        <w:jc w:val="left"/>
-      </w:pPr>
-      <w:r>
-        <w:t>5. Key Talking Points for the Call</w:t>
+        <w:t>Emphasize investor speed: "Even the $900 version gives you a cleaner story to show investors this week instead of next month."</w:t>
       </w:r>
     </w:p>
     <w:p>
@@ -765,7 +1116,7 @@
         <w:rPr>
           <w:sz w:val="22"/>
         </w:rPr>
-        <w:t>Lead with investor angle: "We are not just building a website -- we are building the traction story your investors want to see."</w:t>
+        <w:t>Anchor on value: "$900 is nothing compared to a $500K+ raise. This is an investment in your valuation, not an expense."</w:t>
       </w:r>
     </w:p>
     <w:p>
@@ -777,43 +1128,7 @@
         <w:rPr>
           <w:sz w:val="22"/>
         </w:rPr>
-        <w:t>Emphasize speed: "Phase 1 is live in 2 weeks. You will have a new site before your next investor meeting."</w:t>
-      </w:r>
-    </w:p>
-    <w:p>
-      <w:pPr>
-        <w:pStyle w:val="ListBullet"/>
-        <w:spacing w:after="80"/>
-      </w:pPr>
-      <w:r>
-        <w:rPr>
-          <w:sz w:val="22"/>
-        </w:rPr>
-        <w:t>Use her language: Ask what her current traffic is, what her investor timeline is, what her biggest pain point is. Tailor Phase 1 deliverables to that.</w:t>
-      </w:r>
-    </w:p>
-    <w:p>
-      <w:pPr>
-        <w:pStyle w:val="ListBullet"/>
-        <w:spacing w:after="80"/>
-      </w:pPr>
-      <w:r>
-        <w:rPr>
-          <w:sz w:val="22"/>
-        </w:rPr>
-        <w:t>Anchor on value, not cost: $4,500 is small compared to a $500K+ raise. Frame it as "investment in your raise, not an expense."</w:t>
-      </w:r>
-    </w:p>
-    <w:p>
-      <w:pPr>
-        <w:pStyle w:val="ListBullet"/>
-        <w:spacing w:after="80"/>
-      </w:pPr>
-      <w:r>
-        <w:rPr>
-          <w:sz w:val="22"/>
-        </w:rPr>
-        <w:t>Offer a fast win: "We can have a visual mockup of your new hero section within 48 hours of kickoff so you can start using it in pitches immediately."</w:t>
+        <w:t>Offer fast win: "48-hour mockup of the new hero. You can use it in pitches immediately while we build the rest."</w:t>
       </w:r>
     </w:p>
     <w:p/>
@@ -849,7 +1164,7 @@
           <w:i w:val="0"/>
           <w:sz w:val="22"/>
         </w:rPr>
-        <w:t>Response: "Phase 1 is designed to pay for itself. If it helps you close your raise 2 weeks faster or at a $200K higher valuation, it is already ROI-positive. We can also structure payment -- 50% upfront, 50% on delivery."</w:t>
+        <w:t>Response: "The $900 Starter is designed to be a no-brainer. It pays for itself if it helps you close 2 weeks faster or at a higher valuation. And we can do 50% upfront, 50% on delivery."</w:t>
       </w:r>
     </w:p>
     <w:p>
@@ -875,7 +1190,7 @@
           <w:i w:val="0"/>
           <w:sz w:val="22"/>
         </w:rPr>
-        <w:t>Response: "Every investor will Google you before the meeting. The website is your first pitch. Right now it is a single slide. We are making it a full deck."</w:t>
+        <w:t>Response: "Every investor Googles you before the meeting. The website is your first pitch. For $900 we make sure that pitch is strong."</w:t>
       </w:r>
     </w:p>
     <w:p>
@@ -901,7 +1216,33 @@
           <w:i w:val="0"/>
           <w:sz w:val="22"/>
         </w:rPr>
-        <w:t>Response: "You absolutely could -- but your time is better spent talking to artists and investors. This is 2 weeks of our work vs. 2 months of yours."</w:t>
+        <w:t>Response: "You could - but your time goes to building the app and talking to artists. For $900 we handle it in a week."</w:t>
+      </w:r>
+    </w:p>
+    <w:p>
+      <w:pPr>
+        <w:spacing w:after="160" w:line="240" w:lineRule="auto"/>
+      </w:pPr>
+      <w:r>
+        <w:rPr>
+          <w:b/>
+          <w:i w:val="0"/>
+          <w:sz w:val="22"/>
+        </w:rPr>
+        <w:t>"Why is the full version $3,500?"</w:t>
+      </w:r>
+    </w:p>
+    <w:p>
+      <w:pPr>
+        <w:spacing w:after="160" w:line="240" w:lineRule="auto"/>
+      </w:pPr>
+      <w:r>
+        <w:rPr>
+          <w:b w:val="0"/>
+          <w:i w:val="0"/>
+          <w:sz w:val="22"/>
+        </w:rPr>
+        <w:t>Response: "Starter fixes the headline. Standard builds the whole funnel. If you want investors to see a full product story with trust pages, analytics, social proof, and SEO, that is the tier. You can start at $900 and upgrade anytime."</w:t>
       </w:r>
     </w:p>
     <w:p/>
@@ -915,7 +1256,7 @@
           <w:i w:val="0"/>
           <w:sz w:val="24"/>
         </w:rPr>
-        <w:t>Good luck on the call. Position TorinWorks as the partner that turns her product into a fundable company.</w:t>
+        <w:t>Close on the $900 entry point. The goal is to get started this week. Once she sees the work, the upsell to $3,500 is natural.</w:t>
       </w:r>
     </w:p>
     <w:sectPr>

</xml_diff>